<commit_message>
Page de titre : passage à deux auteures + remerciements PlaTerfood
- Ajout de la co-autrice (Aurélia, nom/affiliation en champs à compléter)
- Catherine Hérault en auteure correspondante
- Remerciements pré-rédigés (répondants au questionnaire + financement PlaTerfood)
- Titre EN aligné ; référence de citation à deux auteures
- DOCX régénéré (pandoc + post-traitement format DM) et recopié dans le paquet de soumission

Co-Authored-By: Claude Opus 4.8 <noreply@anthropic.com>
Claude-Session: https://claude.ai/code/session_01GPMhaLyMn13E1D3y8GrY2W
</commit_message>
<xml_diff>
--- a/outputs/soumission_DM/2_page_de_titre_DM.docx
+++ b/outputs/soumission_DM/2_page_de_titre_DM.docx
@@ -5,18 +5,33 @@
     <w:bookmarkStart w:id="14" w:name="X4af2a5b6927159dbc9d9dad019d1c2c24e7160b"/>
     <w:p>
       <w:pPr>
-        <w:pStyle w:val="Heading1"/>
+        <w:jc w:val="left"/>
       </w:pPr>
       <w:r>
+        <w:rPr>
+          <w:rFonts w:ascii="Times New Roman" w:hAnsi="Times New Roman"/>
+          <w:b/>
+          <w:i w:val="0"/>
+          <w:sz w:val="28"/>
+        </w:rPr>
         <w:t xml:space="preserve">Page de titre — soumission</w:t>
       </w:r>
       <w:r>
+        <w:rPr>
+          <w:rFonts w:ascii="Times New Roman" w:hAnsi="Times New Roman"/>
+          <w:b/>
+          <w:i w:val="0"/>
+          <w:sz w:val="28"/>
+        </w:rPr>
         <w:t xml:space="preserve"> </w:t>
       </w:r>
       <w:r>
         <w:rPr>
-          <w:i/>
+          <w:rFonts w:ascii="Times New Roman" w:hAnsi="Times New Roman"/>
+          <w:b/>
+          <w:i w:val="0"/>
           <w:iCs/>
+          <w:sz w:val="28"/>
         </w:rPr>
         <w:t xml:space="preserve">Décisions Marketing</w:t>
       </w:r>
@@ -42,9 +57,15 @@
     <w:bookmarkStart w:id="9" w:name="titre"/>
     <w:p>
       <w:pPr>
-        <w:pStyle w:val="Heading2"/>
+        <w:jc w:val="left"/>
       </w:pPr>
       <w:r>
+        <w:rPr>
+          <w:rFonts w:ascii="Times New Roman" w:hAnsi="Times New Roman"/>
+          <w:b/>
+          <w:i w:val="0"/>
+          <w:sz w:val="28"/>
+        </w:rPr>
         <w:t xml:space="preserve">Titre</w:t>
       </w:r>
     </w:p>
@@ -71,9 +92,7 @@
       </w:r>
     </w:p>
     <w:p>
-      <w:pPr>
-        <w:pStyle w:val="BodyText"/>
-      </w:pPr>
+      <w:pPr/>
       <w:r>
         <w:rPr>
           <w:b/>
@@ -89,17 +108,30 @@
           <w:i/>
           <w:iCs/>
         </w:rPr>
-        <w:t xml:space="preserve">Many try it, few adopt it: Direct-from-farmer purchasing in the provisioning strategies of French households</w:t>
+        <w:t xml:space="preserve">“Many try it, few adopt it”</w:t>
+      </w:r>
+      <w:r>
+        <w:rPr>
+          <w:i/>
+          <w:iCs/>
+        </w:rPr>
+        <w:t xml:space="preserve">: Direct-from-farmer purchasing in the provisioning strategies of French households</w:t>
       </w:r>
     </w:p>
     <w:bookmarkEnd w:id="9"/>
-    <w:bookmarkStart w:id="10" w:name="auteure"/>
+    <w:bookmarkStart w:id="10" w:name="auteures"/>
     <w:p>
       <w:pPr>
-        <w:pStyle w:val="Heading2"/>
+        <w:jc w:val="left"/>
       </w:pPr>
       <w:r>
-        <w:t xml:space="preserve">Auteur·e</w:t>
+        <w:rPr>
+          <w:rFonts w:ascii="Times New Roman" w:hAnsi="Times New Roman"/>
+          <w:b/>
+          <w:i w:val="0"/>
+          <w:sz w:val="28"/>
+        </w:rPr>
+        <w:t xml:space="preserve">Auteur·e·s</w:t>
       </w:r>
     </w:p>
     <w:p>
@@ -107,6 +139,10 @@
         <w:pStyle w:val="FirstParagraph"/>
       </w:pPr>
       <w:r>
+        <w:rPr>
+          <w:b/>
+          <w:bCs/>
+        </w:rPr>
         <w:t xml:space="preserve">Catherine Hérault</w:t>
       </w:r>
       <w:r>
@@ -117,7 +153,7 @@
           <w:i/>
           <w:iCs/>
         </w:rPr>
-        <w:t xml:space="preserve">(Affiliation, laboratoire, adresse à compléter)</w:t>
+        <w:t xml:space="preserve">(Affiliation, laboratoire, adresse — à compléter)</w:t>
       </w:r>
       <w:r>
         <w:t xml:space="preserve"> </w:t>
@@ -125,14 +161,66 @@
       <w:r>
         <w:t xml:space="preserve">Courriel : catherine.herault@…</w:t>
       </w:r>
+      <w:r>
+        <w:t xml:space="preserve"> </w:t>
+      </w:r>
+      <w:r>
+        <w:rPr>
+          <w:i/>
+          <w:iCs/>
+        </w:rPr>
+        <w:t xml:space="preserve">Auteure correspondante</w:t>
+      </w:r>
+    </w:p>
+    <w:p>
+      <w:pPr/>
+      <w:r>
+        <w:rPr>
+          <w:b/>
+          <w:bCs/>
+        </w:rPr>
+        <w:t xml:space="preserve">Aurélia [NOM À COMPLÉTER]</w:t>
+      </w:r>
+      <w:r>
+        <w:t xml:space="preserve"> </w:t>
+      </w:r>
+      <w:r>
+        <w:rPr>
+          <w:i/>
+          <w:iCs/>
+        </w:rPr>
+        <w:t xml:space="preserve">(Affiliation, laboratoire, adresse — à compléter)</w:t>
+      </w:r>
+      <w:r>
+        <w:t xml:space="preserve"> </w:t>
+      </w:r>
+      <w:r>
+        <w:t xml:space="preserve">Courriel : …</w:t>
+      </w:r>
+    </w:p>
+    <w:p>
+      <w:pPr/>
+      <w:r>
+        <w:rPr>
+          <w:i/>
+          <w:iCs/>
+        </w:rPr>
+        <w:t xml:space="preserve">Ordre des auteures à confirmer.</w:t>
+      </w:r>
     </w:p>
     <w:bookmarkEnd w:id="10"/>
     <w:bookmarkStart w:id="11" w:name="remerciements"/>
     <w:p>
       <w:pPr>
-        <w:pStyle w:val="Heading2"/>
+        <w:jc w:val="left"/>
       </w:pPr>
       <w:r>
+        <w:rPr>
+          <w:rFonts w:ascii="Times New Roman" w:hAnsi="Times New Roman"/>
+          <w:b/>
+          <w:i w:val="0"/>
+          <w:sz w:val="28"/>
+        </w:rPr>
         <w:t xml:space="preserve">Remerciements</w:t>
       </w:r>
     </w:p>
@@ -141,20 +229,48 @@
         <w:pStyle w:val="FirstParagraph"/>
       </w:pPr>
       <w:r>
+        <w:t xml:space="preserve">Les auteures remercient l’ensemble des ménages ayant répondu au questionnaire, ainsi que le projet</w:t>
+      </w:r>
+      <w:r>
+        <w:t xml:space="preserve"> </w:t>
+      </w:r>
+      <w:r>
+        <w:rPr>
+          <w:b/>
+          <w:bCs/>
+        </w:rPr>
+        <w:t xml:space="preserve">PlaTerfood</w:t>
+      </w:r>
+      <w:r>
+        <w:t xml:space="preserve"> </w:t>
+      </w:r>
+      <w:r>
+        <w:t xml:space="preserve">pour le financement de l’enquête.</w:t>
+      </w:r>
+      <w:r>
+        <w:t xml:space="preserve"> </w:t>
+      </w:r>
+      <w:r>
         <w:rPr>
           <w:i/>
           <w:iCs/>
         </w:rPr>
-        <w:t xml:space="preserve">(À compléter — p. ex. financement de l’enquête, relecteurs.)</w:t>
+        <w:t xml:space="preserve">(Préciser, le cas échéant : organisme financeur de l’enquête, n° de convention, personnes ayant contribué à la relecture.)</w:t>
       </w:r>
     </w:p>
     <w:bookmarkEnd w:id="11"/>
     <w:bookmarkStart w:id="12" w:name="déclarations"/>
     <w:p>
       <w:pPr>
-        <w:pStyle w:val="Heading2"/>
+        <w:jc w:val="left"/>
       </w:pPr>
       <w:r>
+        <w:rPr>
+          <w:rFonts w:ascii="Times New Roman" w:hAnsi="Times New Roman"/>
+          <w:b/>
+          <w:i w:val="0"/>
+          <w:sz w:val="28"/>
+        </w:rPr>
         <w:t xml:space="preserve">Déclarations</w:t>
       </w:r>
     </w:p>
@@ -179,7 +295,7 @@
         </w:numPr>
       </w:pPr>
       <w:r>
-        <w:t xml:space="preserve">Données d’enquête (échantillon représentatif national, n = 1 025) anonymisées.</w:t>
+        <w:t xml:space="preserve">Données d’enquête (échantillon représentatif national, n = 1 025) anonymisées ; aucune donnée individuelle diffusée.</w:t>
       </w:r>
     </w:p>
     <w:p>
@@ -198,9 +314,15 @@
     <w:bookmarkStart w:id="13" w:name="référence-de-citation-une-fois-publié"/>
     <w:p>
       <w:pPr>
-        <w:pStyle w:val="Heading2"/>
+        <w:jc w:val="left"/>
       </w:pPr>
       <w:r>
+        <w:rPr>
+          <w:rFonts w:ascii="Times New Roman" w:hAnsi="Times New Roman"/>
+          <w:b/>
+          <w:i w:val="0"/>
+          <w:sz w:val="28"/>
+        </w:rPr>
         <w:t xml:space="preserve">Référence de citation (une fois publié)</w:t>
       </w:r>
     </w:p>
@@ -209,7 +331,7 @@
         <w:pStyle w:val="FirstParagraph"/>
       </w:pPr>
       <w:r>
-        <w:t xml:space="preserve">Hérault C. (année), Beaucoup l’essaient, peu l’adoptent : la vente directe dans les stratégies d’approvisionnement des ménages français,</w:t>
+        <w:t xml:space="preserve">Hérault C. et [Aurélia NOM] A. (année), Beaucoup l’essaient, peu l’adoptent : la vente directe dans les stratégies d’approvisionnement des ménages français,</w:t>
       </w:r>
       <w:r>
         <w:t xml:space="preserve"> </w:t>
@@ -810,6 +932,7 @@
     <w:rsid w:val="00FC693F"/>
     <w:pPr>
       <w:spacing w:line="360" w:lineRule="auto"/>
+      <w:jc w:val="both"/>
     </w:pPr>
     <w:rPr>
       <w:rFonts w:ascii="Times New Roman" w:hAnsi="Times New Roman"/>

</xml_diff>

<commit_message>
Page de titre : noms, affiliations et courriels des deux auteures
- Catherine Hérault-Fournier (nom corrigé, tronqué auparavant) — auteure correspondante
- Aurélia Michaud-Trévinal — orthographe vérifiée (trait d'union)
- Affiliation : laboratoire NUDD, La Rochelle Université ; courriels institutionnels
- Référence de citation à deux auteures mise à jour
- DOCX régénéré et recopié dans le paquet de soumission

Co-Authored-By: Claude Opus 4.8 <noreply@anthropic.com>
Claude-Session: https://claude.ai/code/session_01GPMhaLyMn13E1D3y8GrY2W
</commit_message>
<xml_diff>
--- a/outputs/soumission_DM/2_page_de_titre_DM.docx
+++ b/outputs/soumission_DM/2_page_de_titre_DM.docx
@@ -131,7 +131,7 @@
           <w:i w:val="0"/>
           <w:sz w:val="28"/>
         </w:rPr>
-        <w:t xml:space="preserve">Auteur·e·s</w:t>
+        <w:t xml:space="preserve">Auteures</w:t>
       </w:r>
     </w:p>
     <w:p>
@@ -143,7 +143,13 @@
           <w:b/>
           <w:bCs/>
         </w:rPr>
-        <w:t xml:space="preserve">Catherine Hérault</w:t>
+        <w:t xml:space="preserve">Catherine Hérault-Fournier</w:t>
+      </w:r>
+      <w:r>
+        <w:t xml:space="preserve"> </w:t>
+      </w:r>
+      <w:r>
+        <w:t xml:space="preserve">—</w:t>
       </w:r>
       <w:r>
         <w:t xml:space="preserve"> </w:t>
@@ -153,23 +159,19 @@
           <w:i/>
           <w:iCs/>
         </w:rPr>
-        <w:t xml:space="preserve">(Affiliation, laboratoire, adresse — à compléter)</w:t>
+        <w:t xml:space="preserve">auteure correspondante</w:t>
       </w:r>
       <w:r>
         <w:t xml:space="preserve"> </w:t>
       </w:r>
       <w:r>
-        <w:t xml:space="preserve">Courriel : catherine.herault@…</w:t>
+        <w:t xml:space="preserve">Laboratoire NUDD (Usages du numérique pour le développement durable), La Rochelle Université</w:t>
       </w:r>
       <w:r>
         <w:t xml:space="preserve"> </w:t>
       </w:r>
       <w:r>
-        <w:rPr>
-          <w:i/>
-          <w:iCs/>
-        </w:rPr>
-        <w:t xml:space="preserve">Auteure correspondante</w:t>
+        <w:t xml:space="preserve">Courriel : catherine.herault-fournier@univ-lr.fr</w:t>
       </w:r>
     </w:p>
     <w:p>
@@ -179,33 +181,19 @@
           <w:b/>
           <w:bCs/>
         </w:rPr>
-        <w:t xml:space="preserve">Aurélia [NOM À COMPLÉTER]</w:t>
+        <w:t xml:space="preserve">Aurélia Michaud-Trévinal</w:t>
       </w:r>
       <w:r>
         <w:t xml:space="preserve"> </w:t>
       </w:r>
       <w:r>
-        <w:rPr>
-          <w:i/>
-          <w:iCs/>
-        </w:rPr>
-        <w:t xml:space="preserve">(Affiliation, laboratoire, adresse — à compléter)</w:t>
+        <w:t xml:space="preserve">Laboratoire NUDD (Usages du numérique pour le développement durable), La Rochelle Université</w:t>
       </w:r>
       <w:r>
         <w:t xml:space="preserve"> </w:t>
       </w:r>
       <w:r>
-        <w:t xml:space="preserve">Courriel : …</w:t>
-      </w:r>
-    </w:p>
-    <w:p>
-      <w:pPr/>
-      <w:r>
-        <w:rPr>
-          <w:i/>
-          <w:iCs/>
-        </w:rPr>
-        <w:t xml:space="preserve">Ordre des auteures à confirmer.</w:t>
+        <w:t xml:space="preserve">Courriel : amichaud@univ-lr.fr</w:t>
       </w:r>
     </w:p>
     <w:bookmarkEnd w:id="10"/>
@@ -246,16 +234,6 @@
       </w:r>
       <w:r>
         <w:t xml:space="preserve">pour le financement de l’enquête.</w:t>
-      </w:r>
-      <w:r>
-        <w:t xml:space="preserve"> </w:t>
-      </w:r>
-      <w:r>
-        <w:rPr>
-          <w:i/>
-          <w:iCs/>
-        </w:rPr>
-        <w:t xml:space="preserve">(Préciser, le cas échéant : organisme financeur de l’enquête, n° de convention, personnes ayant contribué à la relecture.)</w:t>
       </w:r>
     </w:p>
     <w:bookmarkEnd w:id="11"/>
@@ -331,7 +309,7 @@
         <w:pStyle w:val="FirstParagraph"/>
       </w:pPr>
       <w:r>
-        <w:t xml:space="preserve">Hérault C. et [Aurélia NOM] A. (année), Beaucoup l’essaient, peu l’adoptent : la vente directe dans les stratégies d’approvisionnement des ménages français,</w:t>
+        <w:t xml:space="preserve">Hérault-Fournier C. et Michaud-Trévinal A. (année), Beaucoup l’essaient, peu l’adoptent : la vente directe dans les stratégies d’approvisionnement des ménages français,</w:t>
       </w:r>
       <w:r>
         <w:t xml:space="preserve"> </w:t>

</xml_diff>